<commit_message>
a few template tweaks
</commit_message>
<xml_diff>
--- a/templates/custom.docx
+++ b/templates/custom.docx
@@ -482,10 +482,72 @@
         <w:t>Item 2</w:t>
       </w:r>
     </w:p>
+    <w:p>
+      <w:pPr>
+        <w:ind w:left="360"/>
+      </w:pPr>
+    </w:p>
+    <w:p>
+      <w:pPr>
+        <w:pStyle w:val="Heading1"/>
+      </w:pPr>
+      <w:r>
+        <w:lastRenderedPageBreak/>
+        <w:t>Bibliography</w:t>
+      </w:r>
+    </w:p>
+    <w:p>
+      <w:pPr>
+        <w:pStyle w:val="Bibliography"/>
+      </w:pPr>
+      <w:proofErr w:type="spellStart"/>
+      <w:r>
+        <w:t>Dumontheil</w:t>
+      </w:r>
+      <w:proofErr w:type="spellEnd"/>
+      <w:r>
+        <w:t xml:space="preserve">, I, Wolf, LK, &amp; Blakemore, S-J (2016) “Audience Effects on the Neural Correlates of Relational Reasoning in Adolescence” </w:t>
+      </w:r>
+      <w:proofErr w:type="spellStart"/>
+      <w:r>
+        <w:rPr>
+          <w:i/>
+          <w:iCs/>
+        </w:rPr>
+        <w:t>Neuropsychologia</w:t>
+      </w:r>
+      <w:proofErr w:type="spellEnd"/>
+      <w:r>
+        <w:t xml:space="preserve"> </w:t>
+      </w:r>
+      <w:r>
+        <w:rPr>
+          <w:b/>
+          <w:bCs/>
+        </w:rPr>
+        <w:t>87</w:t>
+      </w:r>
+      <w:r>
+        <w:t xml:space="preserve">, 85–95 </w:t>
+      </w:r>
+      <w:hyperlink r:id="rId8">
+        <w:r>
+          <w:rPr>
+            <w:rStyle w:val="Hyperlink"/>
+          </w:rPr>
+          <w:t>10.1016/j.neuropsychologia.2016.05.001</w:t>
+        </w:r>
+      </w:hyperlink>
+    </w:p>
+    <w:p>
+      <w:pPr>
+        <w:pStyle w:val="BodyText"/>
+      </w:pPr>
+    </w:p>
     <w:sectPr>
-      <w:headerReference w:type="default" r:id="rId8"/>
-      <w:footerReference w:type="default" r:id="rId9"/>
-      <w:footerReference w:type="first" r:id="rId10"/>
+      <w:headerReference w:type="default" r:id="rId9"/>
+      <w:footerReference w:type="default" r:id="rId10"/>
+      <w:footerReference w:type="first" r:id="rId11"/>
       <w:pgSz w:w="12240" w:h="15840"/>
       <w:pgMar w:top="1134" w:right="1134" w:bottom="1134" w:left="1134" w:header="567" w:footer="567" w:gutter="0"/>
       <w:cols w:space="720"/>
@@ -892,7 +954,7 @@
                             <w:rPr>
                               <w:noProof/>
                             </w:rPr>
-                            <w:t>August 18, 2025</w:t>
+                            <w:t>March 31, 2026</w:t>
                           </w:r>
                           <w:r>
                             <w:fldChar w:fldCharType="end"/>
@@ -945,7 +1007,7 @@
                       <w:rPr>
                         <w:noProof/>
                       </w:rPr>
-                      <w:t>August 18, 2025</w:t>
+                      <w:t>March 31, 2026</w:t>
                     </w:r>
                     <w:r>
                       <w:fldChar w:fldCharType="end"/>
@@ -2963,11 +3025,15 @@
     <w:name w:val="Bibliography"/>
     <w:basedOn w:val="Normal"/>
     <w:qFormat/>
-    <w:rsid w:val="00EF48C7"/>
+    <w:rsid w:val="003032FA"/>
     <w:pPr>
-      <w:spacing w:line="240" w:lineRule="auto"/>
+      <w:spacing w:before="160" w:after="160" w:line="240" w:lineRule="auto"/>
       <w:jc w:val="left"/>
     </w:pPr>
+    <w:rPr>
+      <w:rFonts w:ascii="Alegreya Sans" w:hAnsi="Alegreya Sans"/>
+      <w:sz w:val="22"/>
+    </w:rPr>
   </w:style>
   <w:style w:type="paragraph" w:styleId="BlockText">
     <w:name w:val="Block Text"/>
@@ -4048,7 +4114,7 @@
   </w:font>
   <w:font w:name="Times New Roman">
     <w:panose1 w:val="02020603050405020304"/>
-    <w:charset w:val="CC"/>
+    <w:charset w:val="00"/>
     <w:family w:val="roman"/>
     <w:pitch w:val="variable"/>
     <w:sig w:usb0="E0002EFF" w:usb1="C000785B" w:usb2="00000009" w:usb3="00000000" w:csb0="000001FF" w:csb1="00000000"/>
@@ -4069,7 +4135,7 @@
   </w:font>
   <w:font w:name="Cambria">
     <w:panose1 w:val="02040503050406030204"/>
-    <w:charset w:val="CC"/>
+    <w:charset w:val="00"/>
     <w:family w:val="roman"/>
     <w:pitch w:val="variable"/>
     <w:sig w:usb0="E00002FF" w:usb1="400004FF" w:usb2="00000000" w:usb3="00000000" w:csb0="0000019F" w:csb1="00000000"/>
@@ -4175,10 +4241,10 @@
   </w:font>
   <w:font w:name="Calibri">
     <w:panose1 w:val="020F0502020204030204"/>
-    <w:charset w:val="CC"/>
+    <w:charset w:val="00"/>
     <w:family w:val="swiss"/>
     <w:pitch w:val="variable"/>
-    <w:sig w:usb0="E0002EFF" w:usb1="C000247B" w:usb2="00000009" w:usb3="00000000" w:csb0="000001FF" w:csb1="00000000"/>
+    <w:sig w:usb0="E0002AFF" w:usb1="C000247B" w:usb2="00000009" w:usb3="00000000" w:csb0="000001FF" w:csb1="00000000"/>
   </w:font>
   <w:font w:name="DengXian">
     <w:altName w:val="等线"/>
@@ -4228,6 +4294,7 @@
     <w:rsid w:val="000D4CC8"/>
     <w:rsid w:val="0013517D"/>
     <w:rsid w:val="00282E57"/>
+    <w:rsid w:val="002867CF"/>
     <w:rsid w:val="00287427"/>
     <w:rsid w:val="00346CFE"/>
     <w:rsid w:val="003D57F3"/>
@@ -4240,6 +4307,7 @@
     <w:rsid w:val="005B3EFF"/>
     <w:rsid w:val="00667C3B"/>
     <w:rsid w:val="006E16AE"/>
+    <w:rsid w:val="008C73A0"/>
     <w:rsid w:val="00927E82"/>
     <w:rsid w:val="00986B74"/>
     <w:rsid w:val="009C7660"/>

</xml_diff>